<commit_message>
add diagram, change enum
</commit_message>
<xml_diff>
--- a/programming/lab_3/lab_3.docx
+++ b/programming/lab_3/lab_3.docx
@@ -743,7 +743,6 @@
             </w:r>
             <w:r>
               <w:rPr>
-                <w:rFonts w:hint="eastAsia"/>
                 <w:noProof/>
                 <w:webHidden/>
               </w:rPr>
@@ -828,7 +827,6 @@
             </w:r>
             <w:r>
               <w:rPr>
-                <w:rFonts w:hint="eastAsia"/>
                 <w:noProof/>
                 <w:webHidden/>
               </w:rPr>
@@ -903,7 +901,6 @@
             </w:r>
             <w:r>
               <w:rPr>
-                <w:rFonts w:hint="eastAsia"/>
                 <w:noProof/>
                 <w:webHidden/>
               </w:rPr>
@@ -979,7 +976,6 @@
             </w:r>
             <w:r>
               <w:rPr>
-                <w:rFonts w:hint="eastAsia"/>
                 <w:noProof/>
                 <w:webHidden/>
               </w:rPr>
@@ -1055,7 +1051,6 @@
             </w:r>
             <w:r>
               <w:rPr>
-                <w:rFonts w:hint="eastAsia"/>
                 <w:noProof/>
                 <w:webHidden/>
               </w:rPr>
@@ -1111,7 +1106,6 @@
           <w:rFonts w:cs="Times New Roman"/>
           <w:sz w:val="36"/>
           <w:szCs w:val="32"/>
-          <w:lang w:val="en-US"/>
         </w:rPr>
       </w:pPr>
       <w:bookmarkStart w:id="1" w:name="_Toc150376161"/>
@@ -1141,7 +1135,13 @@
         <w:t xml:space="preserve"> </w:t>
       </w:r>
     </w:p>
-    <w:p/>
+    <w:p>
+      <w:pPr>
+        <w:rPr>
+          <w:rFonts w:hint="eastAsia"/>
+        </w:rPr>
+      </w:pPr>
+    </w:p>
     <w:p>
       <w:pPr>
         <w:shd w:val="clear" w:color="auto" w:fill="FFFFFF"/>
@@ -1159,7 +1159,23 @@
           <w:kern w:val="0"/>
           <w:lang w:val="en-RU" w:eastAsia="ru-RU" w:bidi="ar-SA"/>
         </w:rPr>
-        <w:t>Медуница снова стала просматривать список. Таким образом, Синеглазка добилась, чтобы, кроме Небоськи и Растеряйки, из больницы выписали Молчуна, Пончика и Сиропчика. В больнице остались Пулька, Ворчун и Пилюлькин. Пулька молча терпел такую несправедливость, так как нога у него все еще болела, но Ворчун и Пилюлькин готовы были рвать на себе волосы от досады и сказали, что если к вечеру их не выпишут, то они устроят побег.</w:t>
+        <w:t xml:space="preserve">Медуница снова стала просматривать список. Таким образом, Синеглазка добилась, чтобы, кроме Небоськи и Растеряйки, из больницы выписали Молчуна, Пончика и Сиропчика. В больнице остались Пулька, Ворчун и Пилюлькин. Пулька </w:t>
+      </w:r>
+      <w:r>
+        <w:rPr>
+          <w:rFonts w:ascii="Times New Roman" w:eastAsia="Times New Roman" w:hAnsi="Times New Roman" w:cs="Times New Roman"/>
+          <w:kern w:val="0"/>
+          <w:lang w:eastAsia="ru-RU" w:bidi="ar-SA"/>
+        </w:rPr>
+        <w:t>терпел такую несправедливость</w:t>
+      </w:r>
+      <w:r>
+        <w:rPr>
+          <w:rFonts w:ascii="Times New Roman" w:eastAsia="Times New Roman" w:hAnsi="Times New Roman" w:cs="Times New Roman"/>
+          <w:kern w:val="0"/>
+          <w:lang w:val="en-RU" w:eastAsia="ru-RU" w:bidi="ar-SA"/>
+        </w:rPr>
+        <w:t>, так как нога у него все еще болела, но Ворчун и Пилюлькин готовы были рвать на себе волосы от досады и сказали, что если к вечеру их не выпишут, то они устроят побег.</w:t>
       </w:r>
     </w:p>
     <w:p>
@@ -1514,6 +1530,7 @@
           <w:rFonts w:cs="Times New Roman"/>
           <w:sz w:val="40"/>
           <w:szCs w:val="36"/>
+          <w:lang w:val="en-US"/>
         </w:rPr>
       </w:pPr>
       <w:bookmarkStart w:id="3" w:name="_Toc150376162"/>
@@ -1552,24 +1569,61 @@
         <w:t>:</w:t>
       </w:r>
       <w:bookmarkEnd w:id="3"/>
-    </w:p>
-    <w:p/>
+      <w:r>
+        <w:rPr>
+          <w:rFonts w:cs="Times New Roman"/>
+          <w:sz w:val="40"/>
+          <w:szCs w:val="36"/>
+          <w:lang w:val="en-US"/>
+        </w:rPr>
+        <w:tab/>
+      </w:r>
+    </w:p>
     <w:p>
       <w:pPr>
         <w:rPr>
           <w:rFonts w:hint="eastAsia"/>
-        </w:rPr>
-      </w:pPr>
-      <w:r>
+          <w:lang w:val="en-US"/>
+        </w:rPr>
+      </w:pPr>
+      <w:r>
+        <w:rPr>
+          <w:lang w:val="en-US"/>
+        </w:rPr>
+        <w:t>1 version:</w:t>
+      </w:r>
+    </w:p>
+    <w:p>
+      <w:pPr>
         <w:rPr>
           <w:rFonts w:hint="eastAsia"/>
+        </w:rPr>
+      </w:pPr>
+    </w:p>
+    <w:bookmarkEnd w:id="2"/>
+    <w:p>
+      <w:pPr>
+        <w:rPr>
+          <w:rFonts w:hint="eastAsia"/>
+          <w:lang w:val="en-US"/>
+        </w:rPr>
+        <w:sectPr>
+          <w:pgSz w:w="16838" w:h="11906" w:orient="landscape"/>
+          <w:pgMar w:top="1134" w:right="567" w:bottom="1701" w:left="567" w:header="709" w:footer="709" w:gutter="0"/>
+          <w:cols w:num="2" w:space="709"/>
+          <w:docGrid w:linePitch="360"/>
+        </w:sectPr>
+      </w:pPr>
+      <w:r>
+        <w:rPr>
           <w:noProof/>
+          <w:lang w:val="en-US"/>
         </w:rPr>
         <w:drawing>
-          <wp:inline distT="0" distB="0" distL="0" distR="0" wp14:anchorId="07380E4A" wp14:editId="00AB51B7">
-            <wp:extent cx="9972040" cy="972185"/>
-            <wp:effectExtent l="0" t="0" r="0" b="5715"/>
-            <wp:docPr id="296238769" name="Graphic 2"/>
+          <wp:inline distT="0" distB="0" distL="0" distR="0" wp14:anchorId="2594F43D" wp14:editId="79794E18">
+            <wp:extent cx="9870621" cy="4910169"/>
+            <wp:effectExtent l="0" t="0" r="0" b="5080"/>
+            <wp:docPr id="911342635" name="Picture 4"/>
             <wp:cNvGraphicFramePr>
               <a:graphicFrameLocks xmlns:a="http://schemas.openxmlformats.org/drawingml/2006/main" noChangeAspect="1"/>
             </wp:cNvGraphicFramePr>
@@ -1577,7 +1631,7 @@
               <a:graphicData uri="http://schemas.openxmlformats.org/drawingml/2006/picture">
                 <pic:pic xmlns:pic="http://schemas.openxmlformats.org/drawingml/2006/picture">
                   <pic:nvPicPr>
-                    <pic:cNvPr id="296238769" name="Graphic 296238769"/>
+                    <pic:cNvPr id="911342635" name="Picture 911342635"/>
                     <pic:cNvPicPr/>
                   </pic:nvPicPr>
                   <pic:blipFill>
@@ -1585,9 +1639,6 @@
                       <a:extLst>
                         <a:ext uri="{28A0092B-C50C-407E-A947-70E740481C1C}">
                           <a14:useLocalDpi xmlns:a14="http://schemas.microsoft.com/office/drawing/2010/main" val="0"/>
-                        </a:ext>
-                        <a:ext uri="{96DAC541-7B7A-43D3-8B79-37D633B846F1}">
-                          <asvg:svgBlip xmlns:asvg="http://schemas.microsoft.com/office/drawing/2016/SVG/main" r:embed="rId7"/>
                         </a:ext>
                       </a:extLst>
                     </a:blip>
@@ -1598,7 +1649,7 @@
                   <pic:spPr>
                     <a:xfrm>
                       <a:off x="0" y="0"/>
-                      <a:ext cx="9972040" cy="972185"/>
+                      <a:ext cx="9938942" cy="4944155"/>
                     </a:xfrm>
                     <a:prstGeom prst="rect">
                       <a:avLst/>
@@ -1611,7 +1662,180 @@
         </w:drawing>
       </w:r>
     </w:p>
-    <w:bookmarkEnd w:id="2"/>
+    <w:p>
+      <w:pPr>
+        <w:rPr>
+          <w:rFonts w:hint="eastAsia"/>
+          <w:lang w:val="en-US"/>
+        </w:rPr>
+      </w:pPr>
+      <w:bookmarkStart w:id="4" w:name="_Toc150376163"/>
+    </w:p>
+    <w:p>
+      <w:pPr>
+        <w:pStyle w:val="NoSpacing"/>
+        <w:rPr>
+          <w:rFonts w:hint="eastAsia"/>
+          <w:lang w:val="en-US"/>
+        </w:rPr>
+      </w:pPr>
+      <w:r>
+        <w:t>2</w:t>
+      </w:r>
+      <w:r>
+        <w:rPr>
+          <w:lang w:val="en-US"/>
+        </w:rPr>
+        <w:t xml:space="preserve"> version:</w:t>
+      </w:r>
+    </w:p>
+    <w:p>
+      <w:pPr>
+        <w:pStyle w:val="NoSpacing"/>
+        <w:rPr>
+          <w:rFonts w:hint="eastAsia"/>
+          <w:lang w:val="en-US"/>
+        </w:rPr>
+      </w:pPr>
+    </w:p>
+    <w:p>
+      <w:pPr>
+        <w:pStyle w:val="NoSpacing"/>
+        <w:rPr>
+          <w:rFonts w:hint="eastAsia"/>
+          <w:lang w:val="en-US"/>
+        </w:rPr>
+      </w:pPr>
+    </w:p>
+    <w:p>
+      <w:pPr>
+        <w:pStyle w:val="NoSpacing"/>
+      </w:pPr>
+      <w:r>
+        <w:rPr>
+          <w:noProof/>
+        </w:rPr>
+        <w:drawing>
+          <wp:inline distT="0" distB="0" distL="0" distR="0" wp14:anchorId="1DB9FD09" wp14:editId="79DEE1E3">
+            <wp:extent cx="5760085" cy="5686425"/>
+            <wp:effectExtent l="0" t="0" r="5715" b="3175"/>
+            <wp:docPr id="1259776946" name="Picture 2"/>
+            <wp:cNvGraphicFramePr>
+              <a:graphicFrameLocks xmlns:a="http://schemas.openxmlformats.org/drawingml/2006/main" noChangeAspect="1"/>
+            </wp:cNvGraphicFramePr>
+            <a:graphic xmlns:a="http://schemas.openxmlformats.org/drawingml/2006/main">
+              <a:graphicData uri="http://schemas.openxmlformats.org/drawingml/2006/picture">
+                <pic:pic xmlns:pic="http://schemas.openxmlformats.org/drawingml/2006/picture">
+                  <pic:nvPicPr>
+                    <pic:cNvPr id="1259776946" name="Picture 1259776946"/>
+                    <pic:cNvPicPr/>
+                  </pic:nvPicPr>
+                  <pic:blipFill>
+                    <a:blip r:embed="rId7" cstate="print">
+                      <a:extLst>
+                        <a:ext uri="{28A0092B-C50C-407E-A947-70E740481C1C}">
+                          <a14:useLocalDpi xmlns:a14="http://schemas.microsoft.com/office/drawing/2010/main" val="0"/>
+                        </a:ext>
+                      </a:extLst>
+                    </a:blip>
+                    <a:stretch>
+                      <a:fillRect/>
+                    </a:stretch>
+                  </pic:blipFill>
+                  <pic:spPr>
+                    <a:xfrm>
+                      <a:off x="0" y="0"/>
+                      <a:ext cx="5760085" cy="5686425"/>
+                    </a:xfrm>
+                    <a:prstGeom prst="rect">
+                      <a:avLst/>
+                    </a:prstGeom>
+                  </pic:spPr>
+                </pic:pic>
+              </a:graphicData>
+            </a:graphic>
+          </wp:inline>
+        </w:drawing>
+      </w:r>
+      <w:r>
+        <w:rPr>
+          <w:lang w:val="en-US"/>
+        </w:rPr>
+        <w:tab/>
+      </w:r>
+    </w:p>
+    <w:p>
+      <w:pPr>
+        <w:pStyle w:val="Heading1"/>
+        <w:rPr>
+          <w:u w:val="single"/>
+        </w:rPr>
+      </w:pPr>
+    </w:p>
+    <w:p>
+      <w:pPr>
+        <w:pStyle w:val="Heading1"/>
+        <w:rPr>
+          <w:u w:val="single"/>
+        </w:rPr>
+      </w:pPr>
+    </w:p>
+    <w:p>
+      <w:pPr>
+        <w:pStyle w:val="Heading1"/>
+        <w:rPr>
+          <w:u w:val="single"/>
+        </w:rPr>
+      </w:pPr>
+    </w:p>
+    <w:p>
+      <w:pPr>
+        <w:pStyle w:val="Heading1"/>
+        <w:rPr>
+          <w:u w:val="single"/>
+        </w:rPr>
+      </w:pPr>
+    </w:p>
+    <w:p>
+      <w:pPr>
+        <w:pStyle w:val="Heading1"/>
+        <w:rPr>
+          <w:u w:val="single"/>
+        </w:rPr>
+      </w:pPr>
+    </w:p>
+    <w:p>
+      <w:pPr>
+        <w:pStyle w:val="Heading1"/>
+        <w:rPr>
+          <w:u w:val="single"/>
+        </w:rPr>
+      </w:pPr>
+    </w:p>
+    <w:p>
+      <w:pPr>
+        <w:pStyle w:val="Heading1"/>
+        <w:rPr>
+          <w:u w:val="single"/>
+        </w:rPr>
+      </w:pPr>
+    </w:p>
+    <w:p>
+      <w:pPr>
+        <w:pStyle w:val="Heading1"/>
+        <w:rPr>
+          <w:u w:val="single"/>
+        </w:rPr>
+      </w:pPr>
+    </w:p>
+    <w:p>
+      <w:pPr>
+        <w:pStyle w:val="Heading1"/>
+        <w:rPr>
+          <w:u w:val="single"/>
+        </w:rPr>
+      </w:pPr>
+    </w:p>
     <w:p>
       <w:pPr>
         <w:pStyle w:val="Heading1"/>
@@ -1619,37 +1843,24 @@
         <w:rPr>
           <w:rFonts w:cs="Times New Roman"/>
           <w:u w:val="single"/>
-          <w:lang w:val="en-US"/>
-        </w:rPr>
-        <w:sectPr>
-          <w:pgSz w:w="16838" w:h="11906" w:orient="landscape"/>
-          <w:pgMar w:top="1134" w:right="567" w:bottom="1701" w:left="567" w:header="709" w:footer="709" w:gutter="0"/>
-          <w:cols w:num="2" w:space="709"/>
-          <w:docGrid w:linePitch="360"/>
-        </w:sectPr>
-      </w:pPr>
-    </w:p>
-    <w:p>
-      <w:pPr>
-        <w:pStyle w:val="Heading1"/>
-        <w:rPr>
-          <w:u w:val="single"/>
-        </w:rPr>
-      </w:pPr>
-      <w:bookmarkStart w:id="4" w:name="_Toc150376163"/>
-      <w:r>
-        <w:rPr>
+        </w:rPr>
+      </w:pPr>
+      <w:bookmarkStart w:id="5" w:name="_Toc150376164"/>
+      <w:bookmarkEnd w:id="4"/>
+      <w:r>
+        <w:rPr>
+          <w:rFonts w:cs="Times New Roman"/>
           <w:u w:val="single"/>
         </w:rPr>
         <w:lastRenderedPageBreak/>
         <w:t>Исходный код программы</w:t>
       </w:r>
-      <w:bookmarkEnd w:id="4"/>
-    </w:p>
-    <w:p/>
-    <w:p>
-      <w:pPr>
-        <w:pStyle w:val="NoSpacing"/>
+    </w:p>
+    <w:p>
+      <w:pPr>
+        <w:rPr>
+          <w:rFonts w:hint="eastAsia"/>
+        </w:rPr>
       </w:pPr>
       <w:hyperlink r:id="rId8" w:history="1">
         <w:r>
@@ -1657,12 +1868,16 @@
             <w:rStyle w:val="Hyperlink"/>
             <w:rFonts w:hint="eastAsia"/>
           </w:rPr>
-          <w:t>https://github.com/vanya9090/itmo/tree/main/programming/lab_3/src</w:t>
+          <w:t>https://github.com/vanya9090/itmo/tree/main/programming/lab_3</w:t>
         </w:r>
       </w:hyperlink>
-      <w:r>
-        <w:t xml:space="preserve"> </w:t>
-      </w:r>
+    </w:p>
+    <w:p>
+      <w:pPr>
+        <w:rPr>
+          <w:rFonts w:hint="eastAsia"/>
+        </w:rPr>
+      </w:pPr>
     </w:p>
     <w:p>
       <w:pPr>
@@ -1673,7 +1888,6 @@
           <w:u w:val="single"/>
         </w:rPr>
       </w:pPr>
-      <w:bookmarkStart w:id="5" w:name="_Toc150376164"/>
       <w:r>
         <w:rPr>
           <w:rFonts w:cs="Times New Roman"/>
@@ -1684,7 +1898,13 @@
       </w:r>
       <w:bookmarkEnd w:id="5"/>
     </w:p>
-    <w:p/>
+    <w:p>
+      <w:pPr>
+        <w:rPr>
+          <w:rFonts w:hint="eastAsia"/>
+        </w:rPr>
+      </w:pPr>
+    </w:p>
     <w:p>
       <w:pPr>
         <w:shd w:val="clear" w:color="auto" w:fill="FFFFFF"/>
@@ -1772,6 +1992,7 @@
         <w:rPr>
           <w:rFonts w:ascii="Times New Roman" w:hAnsi="Times New Roman" w:cs="Times New Roman"/>
           <w:szCs w:val="21"/>
+          <w:lang w:val="en-US"/>
         </w:rPr>
       </w:pPr>
       <w:r>
@@ -1795,8 +2016,17 @@
           <w:rFonts w:ascii="Times New Roman" w:hAnsi="Times New Roman" w:cs="Times New Roman"/>
           <w:szCs w:val="21"/>
         </w:rPr>
-        <w:t>Создан персонаж Сиропчик</w:t>
-      </w:r>
+        <w:t xml:space="preserve">Создан персонаж </w:t>
+      </w:r>
+      <w:proofErr w:type="spellStart"/>
+      <w:r>
+        <w:rPr>
+          <w:rFonts w:ascii="Times New Roman" w:hAnsi="Times New Roman" w:cs="Times New Roman"/>
+          <w:szCs w:val="21"/>
+        </w:rPr>
+        <w:t>Сиропчик</w:t>
+      </w:r>
+      <w:proofErr w:type="spellEnd"/>
     </w:p>
     <w:p>
       <w:pPr>
@@ -1868,7 +2098,7 @@
           <w:rFonts w:ascii="Times New Roman" w:hAnsi="Times New Roman" w:cs="Times New Roman"/>
           <w:szCs w:val="21"/>
         </w:rPr>
-        <w:t>Персонаж Медуница умеет читать</w:t>
+        <w:t>Медуница снова стала просматривать список</w:t>
       </w:r>
     </w:p>
     <w:p>
@@ -1879,13 +2109,6 @@
           <w:szCs w:val="21"/>
         </w:rPr>
       </w:pPr>
-      <w:r>
-        <w:rPr>
-          <w:rFonts w:ascii="Times New Roman" w:hAnsi="Times New Roman" w:cs="Times New Roman"/>
-          <w:szCs w:val="21"/>
-        </w:rPr>
-        <w:t>Медуница снова стала просматривать Список.</w:t>
-      </w:r>
     </w:p>
     <w:p>
       <w:pPr>
@@ -1895,6 +2118,13 @@
           <w:szCs w:val="21"/>
         </w:rPr>
       </w:pPr>
+      <w:r>
+        <w:rPr>
+          <w:rFonts w:ascii="Times New Roman" w:hAnsi="Times New Roman" w:cs="Times New Roman"/>
+          <w:szCs w:val="21"/>
+        </w:rPr>
+        <w:t xml:space="preserve">Синеглазка добилась от больницы чтобы: </w:t>
+      </w:r>
     </w:p>
     <w:p>
       <w:pPr>
@@ -1909,7 +2139,7 @@
           <w:rFonts w:ascii="Times New Roman" w:hAnsi="Times New Roman" w:cs="Times New Roman"/>
           <w:szCs w:val="21"/>
         </w:rPr>
-        <w:t>Синеглазка добилась того, что Небоська выписали из Больница</w:t>
+        <w:t>Небоська выписан из Больница</w:t>
       </w:r>
     </w:p>
     <w:p>
@@ -1925,7 +2155,7 @@
           <w:rFonts w:ascii="Times New Roman" w:hAnsi="Times New Roman" w:cs="Times New Roman"/>
           <w:szCs w:val="21"/>
         </w:rPr>
-        <w:t>Местоположение Небоська изменено на Свобода</w:t>
+        <w:t>Растеряйка выписан из Больница</w:t>
       </w:r>
     </w:p>
     <w:p>
@@ -1941,7 +2171,7 @@
           <w:rFonts w:ascii="Times New Roman" w:hAnsi="Times New Roman" w:cs="Times New Roman"/>
           <w:szCs w:val="21"/>
         </w:rPr>
-        <w:t>Синеглазка добилась того, что Растеряйка выписали из Больница</w:t>
+        <w:t>Молчун выписан из Больница</w:t>
       </w:r>
     </w:p>
     <w:p>
@@ -1957,7 +2187,7 @@
           <w:rFonts w:ascii="Times New Roman" w:hAnsi="Times New Roman" w:cs="Times New Roman"/>
           <w:szCs w:val="21"/>
         </w:rPr>
-        <w:t>Местоположение Растеряйка изменено на Свобода</w:t>
+        <w:t>Пончик выписан из Больница</w:t>
       </w:r>
     </w:p>
     <w:p>
@@ -1973,7 +2203,7 @@
           <w:rFonts w:ascii="Times New Roman" w:hAnsi="Times New Roman" w:cs="Times New Roman"/>
           <w:szCs w:val="21"/>
         </w:rPr>
-        <w:t>Синеглазка добилась того, что Молчун выписали из Больница</w:t>
+        <w:t>Сиропчик выписан из Больница</w:t>
       </w:r>
     </w:p>
     <w:p>
@@ -1984,13 +2214,6 @@
           <w:szCs w:val="21"/>
         </w:rPr>
       </w:pPr>
-      <w:r>
-        <w:rPr>
-          <w:rFonts w:ascii="Times New Roman" w:hAnsi="Times New Roman" w:cs="Times New Roman"/>
-          <w:szCs w:val="21"/>
-        </w:rPr>
-        <w:t>Местоположение Молчун изменено на Свобода</w:t>
-      </w:r>
     </w:p>
     <w:p>
       <w:pPr>
@@ -2005,7 +2228,7 @@
           <w:rFonts w:ascii="Times New Roman" w:hAnsi="Times New Roman" w:cs="Times New Roman"/>
           <w:szCs w:val="21"/>
         </w:rPr>
-        <w:t>Синеглазка добилась того, что Пончик выписали из Больница</w:t>
+        <w:t xml:space="preserve">В больнице остались: Пулька Ворчун Пилюлькин </w:t>
       </w:r>
     </w:p>
     <w:p>
@@ -2016,13 +2239,6 @@
           <w:szCs w:val="21"/>
         </w:rPr>
       </w:pPr>
-      <w:r>
-        <w:rPr>
-          <w:rFonts w:ascii="Times New Roman" w:hAnsi="Times New Roman" w:cs="Times New Roman"/>
-          <w:szCs w:val="21"/>
-        </w:rPr>
-        <w:t>Местоположение Пончик изменено на Свобода</w:t>
-      </w:r>
     </w:p>
     <w:p>
       <w:pPr>
@@ -2037,7 +2253,7 @@
           <w:rFonts w:ascii="Times New Roman" w:hAnsi="Times New Roman" w:cs="Times New Roman"/>
           <w:szCs w:val="21"/>
         </w:rPr>
-        <w:t>Синеглазка добилась того, что Сиропчик выписали из Больница</w:t>
+        <w:t>Нога у Пулька все еще болит, поэтому он молча терпит несправедливость</w:t>
       </w:r>
     </w:p>
     <w:p>
@@ -2053,7 +2269,7 @@
           <w:rFonts w:ascii="Times New Roman" w:hAnsi="Times New Roman" w:cs="Times New Roman"/>
           <w:szCs w:val="21"/>
         </w:rPr>
-        <w:t>Местоположение Сиропчик изменено на Свобода</w:t>
+        <w:t>Ворчун готов рвать на себе волосы</w:t>
       </w:r>
     </w:p>
     <w:p>
@@ -2064,6 +2280,13 @@
           <w:szCs w:val="21"/>
         </w:rPr>
       </w:pPr>
+      <w:r>
+        <w:rPr>
+          <w:rFonts w:ascii="Times New Roman" w:hAnsi="Times New Roman" w:cs="Times New Roman"/>
+          <w:szCs w:val="21"/>
+        </w:rPr>
+        <w:t>Пилюлькин готов рвать на себе волосы</w:t>
+      </w:r>
     </w:p>
     <w:p>
       <w:pPr>
@@ -2078,7 +2301,7 @@
           <w:rFonts w:ascii="Times New Roman" w:hAnsi="Times New Roman" w:cs="Times New Roman"/>
           <w:szCs w:val="21"/>
         </w:rPr>
-        <w:t xml:space="preserve">В Больница остались Пулька Ворчун Пилюлькин </w:t>
+        <w:t>Ворчун сказал, что если к вечеру его не выпишут, то он устроит побег</w:t>
       </w:r>
     </w:p>
     <w:p>
@@ -2089,109 +2312,12 @@
           <w:szCs w:val="21"/>
         </w:rPr>
       </w:pPr>
-    </w:p>
-    <w:p>
-      <w:pPr>
-        <w:shd w:val="clear" w:color="auto" w:fill="FFFFFF"/>
-        <w:rPr>
-          <w:rFonts w:ascii="Times New Roman" w:hAnsi="Times New Roman" w:cs="Times New Roman"/>
-          <w:szCs w:val="21"/>
-        </w:rPr>
-      </w:pPr>
-      <w:r>
-        <w:rPr>
-          <w:rFonts w:ascii="Times New Roman" w:hAnsi="Times New Roman" w:cs="Times New Roman"/>
-          <w:szCs w:val="21"/>
-        </w:rPr>
-        <w:t>Персонаж Пулька терпит несправедливость</w:t>
-      </w:r>
-    </w:p>
-    <w:p>
-      <w:pPr>
-        <w:shd w:val="clear" w:color="auto" w:fill="FFFFFF"/>
-        <w:rPr>
-          <w:rFonts w:ascii="Times New Roman" w:hAnsi="Times New Roman" w:cs="Times New Roman"/>
-          <w:szCs w:val="21"/>
-        </w:rPr>
-      </w:pPr>
-      <w:r>
-        <w:rPr>
-          <w:rFonts w:ascii="Times New Roman" w:hAnsi="Times New Roman" w:cs="Times New Roman"/>
-          <w:szCs w:val="21"/>
-        </w:rPr>
-        <w:t>так как Боль в ноге</w:t>
-      </w:r>
-    </w:p>
-    <w:p>
-      <w:pPr>
-        <w:shd w:val="clear" w:color="auto" w:fill="FFFFFF"/>
-        <w:rPr>
-          <w:rFonts w:ascii="Times New Roman" w:hAnsi="Times New Roman" w:cs="Times New Roman"/>
-          <w:szCs w:val="21"/>
-        </w:rPr>
-      </w:pPr>
-    </w:p>
-    <w:p>
-      <w:pPr>
-        <w:shd w:val="clear" w:color="auto" w:fill="FFFFFF"/>
-        <w:rPr>
-          <w:rFonts w:ascii="Times New Roman" w:hAnsi="Times New Roman" w:cs="Times New Roman"/>
-          <w:szCs w:val="21"/>
-        </w:rPr>
-      </w:pPr>
-      <w:r>
-        <w:rPr>
-          <w:rFonts w:ascii="Times New Roman" w:hAnsi="Times New Roman" w:cs="Times New Roman"/>
-          <w:szCs w:val="21"/>
-        </w:rPr>
-        <w:t>Персонаж Ворчун готов рвать волосы</w:t>
-      </w:r>
-    </w:p>
-    <w:p>
-      <w:pPr>
-        <w:shd w:val="clear" w:color="auto" w:fill="FFFFFF"/>
-        <w:rPr>
-          <w:rFonts w:ascii="Times New Roman" w:hAnsi="Times New Roman" w:cs="Times New Roman"/>
-          <w:szCs w:val="21"/>
-        </w:rPr>
-      </w:pPr>
-      <w:r>
-        <w:rPr>
-          <w:rFonts w:ascii="Times New Roman" w:hAnsi="Times New Roman" w:cs="Times New Roman"/>
-          <w:szCs w:val="21"/>
-        </w:rPr>
-        <w:t>Персонаж Ворчун сказал, что если к вечеру его не выпишут, то он устроит побег</w:t>
-      </w:r>
-    </w:p>
-    <w:p>
-      <w:pPr>
-        <w:shd w:val="clear" w:color="auto" w:fill="FFFFFF"/>
-        <w:rPr>
-          <w:rFonts w:ascii="Times New Roman" w:hAnsi="Times New Roman" w:cs="Times New Roman"/>
-          <w:szCs w:val="21"/>
-        </w:rPr>
-      </w:pPr>
-      <w:r>
-        <w:rPr>
-          <w:rFonts w:ascii="Times New Roman" w:hAnsi="Times New Roman" w:cs="Times New Roman"/>
-          <w:szCs w:val="21"/>
-        </w:rPr>
-        <w:t>Персонаж Пилюлькин готов рвать волосы</w:t>
-      </w:r>
-    </w:p>
-    <w:p>
-      <w:pPr>
-        <w:shd w:val="clear" w:color="auto" w:fill="FFFFFF"/>
-        <w:rPr>
-          <w:rFonts w:ascii="Times New Roman" w:hAnsi="Times New Roman" w:cs="Times New Roman"/>
-        </w:rPr>
-      </w:pPr>
-      <w:r>
-        <w:rPr>
-          <w:rFonts w:ascii="Times New Roman" w:hAnsi="Times New Roman" w:cs="Times New Roman"/>
-          <w:szCs w:val="21"/>
-        </w:rPr>
-        <w:t>Персонаж Пилюлькин сказал, что если к вечеру его не выпишут, то он устроит побег</w:t>
+      <w:r>
+        <w:rPr>
+          <w:rFonts w:ascii="Times New Roman" w:hAnsi="Times New Roman" w:cs="Times New Roman"/>
+          <w:szCs w:val="21"/>
+        </w:rPr>
+        <w:t>Пилюлькин сказал, что если к вечеру его не выпишут, то он устроит побег</w:t>
       </w:r>
     </w:p>
     <w:p>
@@ -2213,90 +2339,90 @@
         <w:t>Вывод</w:t>
       </w:r>
     </w:p>
-    <w:p/>
-    <w:p>
-      <w:pPr>
+    <w:p>
+      <w:pPr>
+        <w:rPr>
+          <w:rFonts w:hint="eastAsia"/>
+        </w:rPr>
+      </w:pPr>
+    </w:p>
+    <w:p>
+      <w:pPr>
+        <w:rPr>
+          <w:rFonts w:hint="eastAsia"/>
+        </w:rPr>
+      </w:pPr>
+      <w:r>
+        <w:t xml:space="preserve">В ходе работы над лабораторной работой я научился проектировать </w:t>
+      </w:r>
+      <w:proofErr w:type="spellStart"/>
+      <w:r>
         <w:rPr>
           <w:lang w:val="en-US"/>
         </w:rPr>
-      </w:pPr>
-      <w:r>
-        <w:t xml:space="preserve">В ходе работы над лабораторной работой я научился </w:t>
-      </w:r>
-      <w:r>
-        <w:t>проектировать</w:t>
-      </w:r>
+        <w:t>uml</w:t>
+      </w:r>
+      <w:proofErr w:type="spellEnd"/>
       <w:r>
         <w:t xml:space="preserve"> </w:t>
       </w:r>
+      <w:r>
+        <w:t>диаграммы, научился работать с абстрактными классами и интерфейсами</w:t>
+      </w:r>
+      <w:r>
+        <w:t xml:space="preserve">, </w:t>
+      </w:r>
+      <w:r>
+        <w:t xml:space="preserve">переопределил методы </w:t>
+      </w:r>
+      <w:r>
+        <w:rPr>
+          <w:lang w:val="en-US"/>
+        </w:rPr>
+        <w:t>equals</w:t>
+      </w:r>
+      <w:r>
+        <w:t xml:space="preserve">, </w:t>
+      </w:r>
       <w:proofErr w:type="spellStart"/>
       <w:r>
         <w:rPr>
           <w:lang w:val="en-US"/>
         </w:rPr>
-        <w:t>uml</w:t>
+        <w:t>hashCode</w:t>
       </w:r>
       <w:proofErr w:type="spellEnd"/>
       <w:r>
-        <w:t xml:space="preserve"> </w:t>
-      </w:r>
-      <w:r>
-        <w:t xml:space="preserve">диаграммы, научился работать с абстрактными </w:t>
-      </w:r>
-      <w:r>
-        <w:t>класс</w:t>
-      </w:r>
-      <w:r>
-        <w:t>ами и интерфейсами</w:t>
-      </w:r>
-      <w:r>
         <w:t xml:space="preserve">, </w:t>
       </w:r>
-      <w:r>
-        <w:t xml:space="preserve">переопределил методы </w:t>
-      </w:r>
+      <w:proofErr w:type="spellStart"/>
       <w:r>
         <w:rPr>
           <w:lang w:val="en-US"/>
         </w:rPr>
-        <w:t>equals</w:t>
-      </w:r>
-      <w:r>
-        <w:t xml:space="preserve">, </w:t>
-      </w:r>
-      <w:proofErr w:type="spellStart"/>
+        <w:t>toString</w:t>
+      </w:r>
+      <w:proofErr w:type="spellEnd"/>
+      <w:r>
+        <w:t xml:space="preserve"> и разобрался с принципами </w:t>
+      </w:r>
       <w:r>
         <w:rPr>
           <w:lang w:val="en-US"/>
         </w:rPr>
-        <w:t>hashCode</w:t>
-      </w:r>
-      <w:proofErr w:type="spellEnd"/>
-      <w:r>
-        <w:t xml:space="preserve">, </w:t>
-      </w:r>
-      <w:proofErr w:type="spellStart"/>
-      <w:r>
-        <w:rPr>
-          <w:lang w:val="en-US"/>
-        </w:rPr>
-        <w:t>toString</w:t>
-      </w:r>
-      <w:proofErr w:type="spellEnd"/>
-      <w:r>
-        <w:t xml:space="preserve"> и разобрался с принципами </w:t>
-      </w:r>
-      <w:r>
-        <w:rPr>
-          <w:lang w:val="en-US"/>
-        </w:rPr>
         <w:t>SOLID</w:t>
       </w:r>
       <w:r>
         <w:t>.</w:t>
       </w:r>
     </w:p>
-    <w:p/>
+    <w:p>
+      <w:pPr>
+        <w:rPr>
+          <w:rFonts w:hint="eastAsia"/>
+        </w:rPr>
+      </w:pPr>
+    </w:p>
     <w:p>
       <w:pPr>
         <w:pStyle w:val="Heading1"/>
@@ -2374,42 +2500,19 @@
     <w:p>
       <w:pPr>
         <w:pStyle w:val="ListParagraph"/>
-        <w:numPr>
-          <w:ilvl w:val="0"/>
-          <w:numId w:val="5"/>
-        </w:numPr>
+        <w:ind w:left="1080"/>
         <w:rPr>
           <w:rFonts w:ascii="Times New Roman" w:hAnsi="Times New Roman" w:cs="Times New Roman"/>
           <w:sz w:val="28"/>
           <w:lang w:eastAsia="ru-RU" w:bidi="ar-SA"/>
         </w:rPr>
         <w:sectPr>
-          <w:type w:val="continuous"/>
           <w:pgSz w:w="11906" w:h="16838"/>
           <w:pgMar w:top="567" w:right="1134" w:bottom="567" w:left="1701" w:header="709" w:footer="709" w:gutter="0"/>
           <w:cols w:space="709"/>
           <w:docGrid w:linePitch="360"/>
         </w:sectPr>
       </w:pPr>
-      <w:hyperlink r:id="rId10" w:history="1">
-        <w:r>
-          <w:rPr>
-            <w:rStyle w:val="Hyperlink"/>
-            <w:rFonts w:ascii="Times New Roman" w:hAnsi="Times New Roman" w:cs="Times New Roman" w:hint="eastAsia"/>
-            <w:sz w:val="28"/>
-            <w:lang w:eastAsia="ru-RU" w:bidi="ar-SA"/>
-          </w:rPr>
-          <w:t>https://pokemondb.net/pokedex/</w:t>
-        </w:r>
-      </w:hyperlink>
-      <w:r>
-        <w:rPr>
-          <w:rFonts w:ascii="Arial" w:hAnsi="Arial" w:cs="Arial"/>
-          <w:color w:val="494949"/>
-          <w:szCs w:val="24"/>
-        </w:rPr>
-        <w:t xml:space="preserve"> </w:t>
-      </w:r>
     </w:p>
     <w:p>
       <w:pPr>
@@ -2423,7 +2526,6 @@
       </w:pPr>
     </w:p>
     <w:sectPr>
-      <w:type w:val="continuous"/>
       <w:pgSz w:w="11906" w:h="16838"/>
       <w:pgMar w:top="567" w:right="1134" w:bottom="567" w:left="1701" w:header="709" w:footer="709" w:gutter="0"/>
       <w:cols w:num="2" w:space="709"/>
@@ -3827,6 +3929,7 @@
   <w:style w:type="character" w:default="1" w:styleId="DefaultParagraphFont">
     <w:name w:val="Default Paragraph Font"/>
     <w:uiPriority w:val="1"/>
+    <w:semiHidden/>
     <w:unhideWhenUsed/>
   </w:style>
   <w:style w:type="table" w:default="1" w:styleId="TableNormal">

</xml_diff>